<commit_message>
docs(audri): record Updated Task List answers and resend spreadsheet
- Add AUDRI_UPDATED_TASK_LIST_ANSWERS.md with cutover rules, ID map, and Q1Q21 readings
- Record Audri's ticks in AUDRI_UPDATED_TASK_LIST_QUESTIONS.md and archive source tab as QUESTIONS_A.md
- Add Updated_AI_Task_List.csv (corrected resend) plus ack/wait-to-test reply drafts
- Add docx output and generate_audri_task_list_answers_docx.py
- Clarify CASA M9j OpenAI evidence: Sharing tab (three Disabled radios), not Data retention or ZDR
</commit_message>
<xml_diff>
--- a/AUDRI_UPDATED_TASK_LIST_QUESTIONS.docx
+++ b/AUDRI_UPDATED_TASK_LIST_QUESTIONS.docx
@@ -212,6 +212,35 @@
           </w:p>
         </w:tc>
       </w:tr>
+      <w:tr>
+        <w:tc>
+          <w:tcPr>
+            <w:tcW w:type="dxa" w:w="4680"/>
+          </w:tcPr>
+          <w:p>
+            <w:r>
+              <w:rPr>
+                <w:b/>
+                <w:sz w:val="20"/>
+              </w:rPr>
+              <w:t>Audri answered</w:t>
+            </w:r>
+          </w:p>
+        </w:tc>
+        <w:tc>
+          <w:tcPr>
+            <w:tcW w:type="dxa" w:w="4680"/>
+          </w:tcPr>
+          <w:p>
+            <w:r>
+              <w:rPr>
+                <w:sz w:val="20"/>
+              </w:rPr>
+              <w:t>August 24, 2026 — ticks recorded from the shared Google Doc; resend spreadsheet is `Updated_AI_Task_List.csv`. Working reading: `AUDRI_UPDATED_TASK_LIST_ANSWERS.md`.</w:t>
+            </w:r>
+          </w:p>
+        </w:tc>
+      </w:tr>
     </w:tbl>
     <w:p>
       <w:r>
@@ -417,7 +446,7 @@
                 <w:b/>
                 <w:sz w:val="20"/>
               </w:rPr>
-              <w:t>My recommendation</w:t>
+              <w:t>Recorded answer</w:t>
             </w:r>
           </w:p>
         </w:tc>
@@ -491,7 +520,7 @@
                 <w:b w:val="0"/>
                 <w:sz w:val="20"/>
               </w:rPr>
-              <w:t>Keep buyer-side and seller-side tasks. One instance of shared tasks such as Order Title. Do not skip the whole file.</w:t>
+              <w:t>Drop the global skip. Vendor targets once. Buyer or seller targets both.</w:t>
             </w:r>
           </w:p>
         </w:tc>
@@ -565,7 +594,7 @@
                 <w:b w:val="0"/>
                 <w:sz w:val="20"/>
               </w:rPr>
-              <w:t>Keep 80 as a follow-up. Withhold personal-property / monetary amendments. Do not re-send the full package unless title was never ordered.</w:t>
+              <w:t>Same package, different script (we order vs courtesy when co-op orders).</w:t>
             </w:r>
           </w:p>
         </w:tc>
@@ -639,7 +668,7 @@
                 <w:b w:val="0"/>
                 <w:sz w:val="20"/>
               </w:rPr>
-              <w:t>Add HOA deliver and utility deliver only if you grant them. Do not add CTC, CD, closing-information, referrals, or thank-yous to unattended send.</w:t>
+              <w:t>Request tasks may send. Deliver after the file/info is in. CTC, CD, closing-information, testimonials on Autopilot.</w:t>
             </w:r>
           </w:p>
         </w:tc>
@@ -713,7 +742,7 @@
                 <w:b w:val="0"/>
                 <w:sz w:val="20"/>
               </w:rPr>
-              <w:t>Keep it human. Reminders may send. Negotiation does not.</w:t>
+              <w:t>Intermediary: parse responses. Aime does not negotiate terms.</w:t>
             </w:r>
           </w:p>
         </w:tc>
@@ -787,7 +816,7 @@
                 <w:b w:val="0"/>
                 <w:sz w:val="20"/>
               </w:rPr>
-              <w:t>Internal reminder for us. Drafted for Send. Not an email to the warranty company.</w:t>
+              <w:t>Internal reminder to the agent and TC.</w:t>
             </w:r>
           </w:p>
         </w:tc>
@@ -861,7 +890,7 @@
                 <w:b w:val="0"/>
                 <w:sz w:val="20"/>
               </w:rPr>
-              <w:t>To = co-op agent. TC on copy when a TC is on the file.</w:t>
+              <w:t>To = co-op agent. TC on copy when assigned.</w:t>
             </w:r>
           </w:p>
         </w:tc>
@@ -935,7 +964,7 @@
                 <w:b w:val="0"/>
                 <w:sz w:val="20"/>
               </w:rPr>
-              <w:t>Keep live 271 for both cash sides (buyer on Buy-Cash; co-op + TC on Sell-Cash). Do not add 267/275 as new IDs.</w:t>
+              <w:t>Split by target. Keep 271 Buy-Cash. Add 267 / 275 Sell-Cash.</w:t>
             </w:r>
           </w:p>
         </w:tc>
@@ -1009,7 +1038,7 @@
                 <w:b w:val="0"/>
                 <w:sz w:val="20"/>
               </w:rPr>
-              <w:t>Keep Request Testimonials. Do not ask for referrals. Keep internal thank-yous as feedback, not sales emails.</w:t>
+              <w:t>Keep Request Testimonials and feedback emails. Scripts to follow.</w:t>
             </w:r>
           </w:p>
         </w:tc>
@@ -1083,7 +1112,7 @@
                 <w:b w:val="0"/>
                 <w:sz w:val="20"/>
               </w:rPr>
-              <w:t>December 1 blast to buyers on files that closed that year. Year-aware deadline. Manual does not send it unattended.</w:t>
+              <w:t>December 1 blast to buyers on files that closed that year.</w:t>
             </w:r>
           </w:p>
         </w:tc>
@@ -1157,7 +1186,7 @@
                 <w:b w:val="0"/>
                 <w:sz w:val="20"/>
               </w:rPr>
-              <w:t>Ship the title commitment now. Cloud summary as a follow-on.</w:t>
+              <w:t>Title commitment now. Cloud summary later.</w:t>
             </w:r>
           </w:p>
         </w:tc>
@@ -1231,7 +1260,7 @@
                 <w:b w:val="0"/>
                 <w:sz w:val="20"/>
               </w:rPr>
-              <w:t>Confirm whether next-day 10am follow-up and the 3-day “step in” nags are in this cutover.</w:t>
+              <w:t>Both timers in this cutover.</w:t>
             </w:r>
           </w:p>
         </w:tc>
@@ -1305,7 +1334,7 @@
                 <w:b w:val="0"/>
                 <w:sz w:val="20"/>
               </w:rPr>
-              <w:t>CC only who is listed on that row, plus Agent and TC when they are listed or already on the file as assigned TC.</w:t>
+              <w:t>Do not invent extra CCs on library rows. Agent/TC on user-added tasks.</w:t>
             </w:r>
           </w:p>
         </w:tc>
@@ -1379,7 +1408,7 @@
                 <w:b w:val="0"/>
                 <w:sz w:val="20"/>
               </w:rPr>
-              <w:t>Keep them. They came from earlier notes from you.</w:t>
+              <w:t>Drop 235. Keep lockbox / MLS as live 453 / 455.</w:t>
             </w:r>
           </w:p>
         </w:tc>
@@ -1453,7 +1482,7 @@
                 <w:b w:val="0"/>
                 <w:sz w:val="20"/>
               </w:rPr>
-              <w:t>Confirm the readings in Section 2.</w:t>
+              <w:t>Confirmed. Resend spreadsheet is the corrected file.</w:t>
             </w:r>
           </w:p>
         </w:tc>
@@ -1602,7 +1631,7 @@
           <w:b w:val="0"/>
           <w:sz w:val="20"/>
         </w:rPr>
-        <w:t>[ ] Different: ________________________________</w:t>
+        <w:t>[x] Different: Disregard and remove this rule. If the target is a vendor (Title and Loan Officer) then only one instance of the task populates. If the target is buyer or seller both instances of the task populates.</w:t>
       </w:r>
     </w:p>
     <w:p>
@@ -1706,7 +1735,7 @@
           <w:b w:val="0"/>
           <w:sz w:val="20"/>
         </w:rPr>
-        <w:t>[ ] 70 and 80 should send the same full package</w:t>
+        <w:t>[x] 70 and 80 should send the same full package — The only difference is scripting. For example task 70 is the task for the transaction agent to order title. Task 80 is for when the co-op agent is ordering title. E.g. “As a courtesy to \&lt;co-op agent name\&gt; would like to engage you as the escrow agent....”</w:t>
       </w:r>
     </w:p>
     <w:p>
@@ -1962,7 +1991,31 @@
           <w:b w:val="0"/>
           <w:sz w:val="20"/>
         </w:rPr>
-        <w:t>[ ] Different: ________________________________</w:t>
+        <w:t>[x] Different: Request task types should send on autopilot. They are scripts sent to the target asking for information. E.g., Clear to Close - “Hi \&lt;loan officer name\&gt;, have you received the CTC from the underwriter yet? If not, when do you expect to receive it?” Then, if the loan officer responds with “Yes, we have the CTC” the AI completes the task. If the answer is no, AI should respond with “when do you expect the CTC?” If the answer is no, it should be by 27-aug. Then the AI should reschedule the task for 27-aug and run a follow up script to ensure they have received the CTC.</w:t>
+      </w:r>
+    </w:p>
+    <w:p>
+      <w:pPr>
+        <w:spacing w:after="80"/>
+      </w:pPr>
+      <w:r>
+        <w:rPr>
+          <w:b w:val="0"/>
+          <w:sz w:val="20"/>
+        </w:rPr>
+        <w:t>So, Clear to Close, Closing Disclosure Delivered, closing-information, referrals tasks can all run on Auto if we explain to our agent the nature of these tasks. The Thank You task is simply a delivered email from VE thanking the targets for using the app and requesting them to do so in the future.</w:t>
+      </w:r>
+    </w:p>
+    <w:p>
+      <w:pPr>
+        <w:spacing w:after="80"/>
+      </w:pPr>
+      <w:r>
+        <w:rPr>
+          <w:b w:val="0"/>
+          <w:sz w:val="20"/>
+        </w:rPr>
+        <w:t>Also, to be clear, the deliver tasks only happen if AI has parsed an email and finds an attachment or information in the email that matches the requested information. (Utilities can be attached or included in an email, HOA documents will always be an attachment like title work is.) Once the request task goes out and the response is received AI will upload any attachment in the Document Center and complete the delivery task. (Deliver Title, HOA Docs, Utility Info, etc.) If the information isn’t an attachment, it will copy and paste the information (Utility Info) in a script to the target (buyer) and complete the task. So, the “request is done” when the app receives the requested information. If the confidence is low (on autopilot) then it treats the task like Assisted and drafts the email and notifies the transaction agent and/or TC (the user(s)) that manual intervention/review is required to complete the task. (then the learning agent continues to learn how to complete this task for future iterations in our overnight review process).</w:t>
       </w:r>
     </w:p>
     <w:p>
@@ -2086,7 +2139,7 @@
           <w:b w:val="0"/>
           <w:sz w:val="20"/>
         </w:rPr>
-        <w:t>[ ] Different: ________________________________</w:t>
+        <w:t>[x] Different: The Inspection negotiated task is not AI negotiating terms/inspection requests. This task is asking the transaction agent and parsing the inspection responses for any new requests, buyer &amp; sellers responses and any accepted responses signed by both the buyer and seller. So AI is only acting as an intermediary for the transaction agent, not negotiating any terms.</w:t>
       </w:r>
     </w:p>
     <w:p>
@@ -2210,7 +2263,7 @@
           <w:b w:val="0"/>
           <w:sz w:val="20"/>
         </w:rPr>
-        <w:t>[ ] Different: ________________________________</w:t>
+        <w:t>[x] Different: This is an internal reminder to the transaction agent and TC to order the home warranty.</w:t>
       </w:r>
     </w:p>
     <w:p>
@@ -2294,7 +2347,7 @@
           <w:b w:val="0"/>
           <w:sz w:val="20"/>
         </w:rPr>
-        <w:t>[ ] To = co-op agent. TC on copy when assigned</w:t>
+        <w:t>[x] To = co-op agent. TC on copy when assigned</w:t>
       </w:r>
     </w:p>
     <w:p>
@@ -2478,7 +2531,7 @@
           <w:b w:val="0"/>
           <w:sz w:val="20"/>
         </w:rPr>
-        <w:t>[ ] Different: ________________________________</w:t>
+        <w:t>[x] Different: We added 271 (Buy-Cash) because the target is different.</w:t>
       </w:r>
     </w:p>
     <w:p>
@@ -2562,7 +2615,7 @@
           <w:b w:val="0"/>
           <w:sz w:val="20"/>
         </w:rPr>
-        <w:t>[ ] Keep testimonials + feedback emails (current product)</w:t>
+        <w:t>[x] Keep testimonials + feedback emails (current product)</w:t>
       </w:r>
     </w:p>
     <w:p>
@@ -2627,6 +2680,18 @@
     </w:p>
     <w:p>
       <w:pPr>
+        <w:spacing w:after="80"/>
+      </w:pPr>
+      <w:r>
+        <w:rPr>
+          <w:b w:val="0"/>
+          <w:sz w:val="20"/>
+        </w:rPr>
+        <w:t>These will be sent to the target and we will provide scripts for clarity.</w:t>
+      </w:r>
+    </w:p>
+    <w:p>
+      <w:pPr>
         <w:spacing w:after="120"/>
       </w:pPr>
     </w:p>
@@ -2779,7 +2844,7 @@
           <w:b w:val="0"/>
           <w:sz w:val="20"/>
         </w:rPr>
-        <w:t>[ ] Yes — as written above</w:t>
+        <w:t>[x] Yes — as written above</w:t>
       </w:r>
     </w:p>
     <w:p>
@@ -2923,7 +2988,7 @@
           <w:b w:val="0"/>
           <w:sz w:val="20"/>
         </w:rPr>
-        <w:t>[ ] Title commitment now. Cloud summary later</w:t>
+        <w:t>[x] Title commitment now. Cloud summary later</w:t>
       </w:r>
     </w:p>
     <w:p>
@@ -3099,7 +3164,7 @@
           <w:b w:val="0"/>
           <w:sz w:val="20"/>
         </w:rPr>
-        <w:t>[ ] Both timers in this cutover</w:t>
+        <w:t>[x] Both timers in this cutover</w:t>
       </w:r>
     </w:p>
     <w:p>
@@ -3323,7 +3388,7 @@
           <w:b w:val="0"/>
           <w:sz w:val="20"/>
         </w:rPr>
-        <w:t>[ ] Different: ________________________________</w:t>
+        <w:t>[x] Different: We agree, do not invent extra CCs. The rule exists so when/if a user or AI adds additional tasks then the agent/TC would be CC’d on those task communications, if applicable.</w:t>
       </w:r>
     </w:p>
     <w:p>
@@ -3519,7 +3584,67 @@
           <w:b w:val="0"/>
           <w:sz w:val="20"/>
         </w:rPr>
-        <w:t>[ ] Different: ________________________________</w:t>
+        <w:t>[x] Different:</w:t>
+      </w:r>
+    </w:p>
+    <w:p>
+      <w:pPr>
+        <w:spacing w:after="40"/>
+        <w:ind w:left="714" w:hanging="255"/>
+      </w:pPr>
+      <w:r>
+        <w:rPr>
+          <w:b w:val="0"/>
+          <w:sz w:val="20"/>
+        </w:rPr>
+        <w:t xml:space="preserve">- </w:t>
+      </w:r>
+      <w:r>
+        <w:rPr>
+          <w:b w:val="0"/>
+          <w:sz w:val="20"/>
+        </w:rPr>
+        <w:t>235 Inspection Completed (seller follow-up) — Task is not necessary because sellers do not have inspections.</w:t>
+      </w:r>
+    </w:p>
+    <w:p>
+      <w:pPr>
+        <w:spacing w:after="40"/>
+        <w:ind w:left="714" w:hanging="255"/>
+      </w:pPr>
+      <w:r>
+        <w:rPr>
+          <w:b w:val="0"/>
+          <w:sz w:val="20"/>
+        </w:rPr>
+        <w:t xml:space="preserve">- </w:t>
+      </w:r>
+      <w:r>
+        <w:rPr>
+          <w:b w:val="0"/>
+          <w:sz w:val="20"/>
+        </w:rPr>
+        <w:t>453 Pick Up Sign and Lockbox — This has been added back in and is now task 470 with a dependency of −5 days.</w:t>
+      </w:r>
+    </w:p>
+    <w:p>
+      <w:pPr>
+        <w:spacing w:after="40"/>
+        <w:ind w:left="714" w:hanging="255"/>
+      </w:pPr>
+      <w:r>
+        <w:rPr>
+          <w:b w:val="0"/>
+          <w:sz w:val="20"/>
+        </w:rPr>
+        <w:t xml:space="preserve">- </w:t>
+      </w:r>
+      <w:r>
+        <w:rPr>
+          <w:b w:val="0"/>
+          <w:sz w:val="20"/>
+        </w:rPr>
+        <w:t>455 Update MLS to Sold — This has been added back in and is now task 480.</w:t>
       </w:r>
     </w:p>
     <w:p>
@@ -3605,7 +3730,7 @@
           <w:b w:val="0"/>
           <w:sz w:val="20"/>
         </w:rPr>
-        <w:t>[ ] That should say utility info, not HOA</w:t>
+        <w:t>[x] That should say utility info, not HOA (updated spreadsheet and will resend)</w:t>
       </w:r>
     </w:p>
     <w:p>
@@ -3710,7 +3835,7 @@
           <w:b w:val="0"/>
           <w:sz w:val="20"/>
         </w:rPr>
-        <w:t>[ ] To = co-op / buyer’s agent (notes win)</w:t>
+        <w:t>[x] To = co-op / buyer’s agent (notes win)</w:t>
       </w:r>
     </w:p>
     <w:p>
@@ -3815,7 +3940,7 @@
           <w:b w:val="0"/>
           <w:sz w:val="20"/>
         </w:rPr>
-        <w:t>[ ] Depend on 245. Notify the seller</w:t>
+        <w:t>[x] Depend on 245. Notify the seller</w:t>
       </w:r>
     </w:p>
     <w:p>
@@ -3920,7 +4045,7 @@
           <w:b w:val="0"/>
           <w:sz w:val="20"/>
         </w:rPr>
-        <w:t>[ ] Treat them as Sell-Cash / Buy-Cash</w:t>
+        <w:t>[x] Treat them as Sell-Cash / Buy-Cash (spreadsheet is updated and will resend)</w:t>
       </w:r>
     </w:p>
     <w:p>
@@ -4045,7 +4170,7 @@
           <w:b w:val="0"/>
           <w:sz w:val="20"/>
         </w:rPr>
-        <w:t>[ ] Different: ________________________________</w:t>
+        <w:t>[x] Different: Updated spreadsheet and will resend.</w:t>
       </w:r>
     </w:p>
     <w:p>
@@ -4131,7 +4256,7 @@
           <w:b w:val="0"/>
           <w:sz w:val="20"/>
         </w:rPr>
-        <w:t>[ ] Different: ________________________________</w:t>
+        <w:t>[x] Different: Updated spreadsheet. Will resend.</w:t>
       </w:r>
     </w:p>
     <w:p>
@@ -4196,7 +4321,7 @@
           <w:b w:val="0"/>
           <w:sz w:val="20"/>
         </w:rPr>
-        <w:t>[ ] Ignore the global line. Question 1 is the rule</w:t>
+        <w:t>[x] Ignore the global line. Question 1 is the rule</w:t>
       </w:r>
     </w:p>
     <w:p>
@@ -4301,7 +4426,7 @@
           <w:b w:val="0"/>
           <w:sz w:val="20"/>
         </w:rPr>
-        <w:t>[ ] Merge those asks into the welcome</w:t>
+        <w:t>[x] Merge those asks into the welcome</w:t>
       </w:r>
     </w:p>
     <w:p>
@@ -4347,19 +4472,22 @@
           <w:b w:val="0"/>
           <w:sz w:val="20"/>
         </w:rPr>
-        <w:t>I will not touch live deals until these answers are in. Existing open tasks keep their current IDs and history. New deals, and a targeted refresh of templates, pick up the updated library.</w:t>
-      </w:r>
-    </w:p>
-    <w:p>
-      <w:pPr>
-        <w:spacing w:after="80"/>
-      </w:pPr>
+        <w:t xml:space="preserve">Answers are in. Existing open tasks keep their current IDs and history. New deals, and a targeted refresh of templates, pick up the updated library. Working reading and ID map: </w:t>
+      </w:r>
+      <w:r>
+        <w:rPr>
+          <w:rFonts w:ascii="Consolas" w:hAnsi="Consolas"/>
+          <w:b w:val="0"/>
+          <w:sz w:val="20"/>
+        </w:rPr>
+        <w:t>AUDRI_UPDATED_TASK_LIST_ANSWERS.md</w:t>
+      </w:r>
       <w:r>
         <w:rPr>
           <w:b w:val="0"/>
           <w:sz w:val="20"/>
         </w:rPr>
-        <w:t>If you want, I can send a one-page map of old ID → kept ID → new behavior before I apply it.</w:t>
+        <w:t>.</w:t>
       </w:r>
     </w:p>
     <w:sectPr>

</xml_diff>